<commit_message>
Standplaats Jacobus van Merksteijn van Tokio naar Malta gewijzigd in alle edities, bronnen en build-scripts
</commit_message>
<xml_diff>
--- a/assets/downloads-editie-7/editie7_aflevering-12-de-vierde-weg-en-open-vizier.docx
+++ b/assets/downloads-editie-7/editie7_aflevering-12-de-vierde-weg-en-open-vizier.docx
@@ -86,7 +86,7 @@
         <w:t xml:space="preserve"> </w:t>
       </w:r>
       <w:r>
-        <w:t xml:space="preserve">Dat is precies wat hier níet gebeurt, en de reden moet expliciet worden gemaakt. Het Open Vizier is een publicatieproject, geen organisatie. Het heeft geen ledenadministratie, geen verkiesbare functies, geen partijbestuur, geen contributiebetaling, geen jaarvergadering. Het heeft één auteur in Tokio die schrijft, en een groeiende kring lezers die meedenkt. Het zou onverdedigbaar zijn — onder dezelfde naam Open Vizier — om vanuit deze positie een beweging te claimen alsof zij al bestond. Zij bestaat niet. Wat bestaat is het ontwerp.</w:t>
+        <w:t xml:space="preserve">Dat is precies wat hier níet gebeurt, en de reden moet expliciet worden gemaakt. Het Open Vizier is een publicatieproject, geen organisatie. Het heeft geen ledenadministratie, geen verkiesbare functies, geen partijbestuur, geen contributiebetaling, geen jaarvergadering. Het heeft één auteur in Malta die schrijft, en een groeiende kring lezers die meedenkt. Het zou onverdedigbaar zijn — onder dezelfde naam Open Vizier — om vanuit deze positie een beweging te claimen alsof zij al bestond. Zij bestaat niet. Wat bestaat is het ontwerp.</w:t>
       </w:r>
     </w:p>
     <w:p>
@@ -297,7 +297,7 @@
         <w:pStyle w:val="BodyText"/>
       </w:pPr>
       <w:r>
-        <w:t xml:space="preserve">Of die vierde weg ooit wordt belopen, beslist Europa zelf. Het Open Vizier publiceert het kaartmateriaal. De stappen worden door anderen gezet. Wij wachten in Tokio met open vizier — niet met opgeheven vinger maar met opengeklapte plattegrond, beschikbaar voor wie haar wil zien.</w:t>
+        <w:t xml:space="preserve">Of die vierde weg ooit wordt belopen, beslist Europa zelf. Het Open Vizier publiceert het kaartmateriaal. De stappen worden door anderen gezet. Wij wachten in Malta met open vizier — niet met opgeheven vinger maar met opengeklapte plattegrond, beschikbaar voor wie haar wil zien.</w:t>
       </w:r>
     </w:p>
     <w:p>

</xml_diff>